<commit_message>
Fix review issues: orphan guard, stale manifest, README limitation
Co-authored-by: Cursor <cursoragent@cursor.com>
</commit_message>
<xml_diff>
--- a/submissions/word-document-generator-from-template/assets/sample-template.docx
+++ b/submissions/word-document-generator-from-template/assets/sample-template.docx
@@ -422,6 +422,129 @@
     </w:tbl>
     <w:p>
       <w:pPr>
+        <w:pStyle w:val="Heading2"/>
+      </w:pPr>
+      <w:r>
+        <w:t>Findings: Affected Hosts</w:t>
+      </w:r>
+    </w:p>
+    <w:tbl>
+      <w:tblPr>
+        <w:tblStyle w:val="TableGrid"/>
+        <w:tblW w:type="auto" w:w="0"/>
+        <w:tblLook w:firstColumn="1" w:firstRow="1" w:lastColumn="0" w:lastRow="0" w:noHBand="0" w:noVBand="1" w:val="04A0"/>
+      </w:tblPr>
+      <w:tblGrid>
+        <w:gridCol w:w="3312"/>
+        <w:gridCol w:w="3312"/>
+        <w:gridCol w:w="3312"/>
+      </w:tblGrid>
+      <w:tr>
+        <w:tc>
+          <w:tcPr>
+            <w:tcW w:type="dxa" w:w="3312"/>
+          </w:tcPr>
+          <w:p>
+            <w:r>
+              <w:rPr>
+                <w:b/>
+              </w:rPr>
+              <w:t>Finding (Affected Hosts)</w:t>
+            </w:r>
+          </w:p>
+        </w:tc>
+        <w:tc>
+          <w:tcPr>
+            <w:tcW w:type="dxa" w:w="3312"/>
+          </w:tcPr>
+          <w:p>
+            <w:r>
+              <w:rPr>
+                <w:b/>
+              </w:rPr>
+              <w:t>Host Name</w:t>
+            </w:r>
+          </w:p>
+        </w:tc>
+        <w:tc>
+          <w:tcPr>
+            <w:tcW w:type="dxa" w:w="3312"/>
+          </w:tcPr>
+          <w:p>
+            <w:r>
+              <w:rPr>
+                <w:b/>
+              </w:rPr>
+              <w:t>Host IP</w:t>
+            </w:r>
+          </w:p>
+        </w:tc>
+      </w:tr>
+      <w:tr>
+        <w:tc>
+          <w:tcPr>
+            <w:tcW w:type="dxa" w:w="3312"/>
+          </w:tcPr>
+          <w:p>
+            <w:r/>
+            <w:r>
+              <w:t>{{</w:t>
+            </w:r>
+            <w:r>
+              <w:rPr>
+                <w:b/>
+              </w:rPr>
+              <w:t>findings[].finding</w:t>
+            </w:r>
+            <w:r>
+              <w:t>}}</w:t>
+            </w:r>
+          </w:p>
+        </w:tc>
+        <w:tc>
+          <w:tcPr>
+            <w:tcW w:type="dxa" w:w="3312"/>
+          </w:tcPr>
+          <w:p>
+            <w:r/>
+            <w:r>
+              <w:t>{{</w:t>
+            </w:r>
+            <w:r>
+              <w:rPr>
+                <w:b/>
+              </w:rPr>
+              <w:t>findings[].hosts[].name</w:t>
+            </w:r>
+            <w:r>
+              <w:t>}}</w:t>
+            </w:r>
+          </w:p>
+        </w:tc>
+        <w:tc>
+          <w:tcPr>
+            <w:tcW w:type="dxa" w:w="3312"/>
+          </w:tcPr>
+          <w:p>
+            <w:r/>
+            <w:r>
+              <w:t>{{</w:t>
+            </w:r>
+            <w:r>
+              <w:rPr>
+                <w:b/>
+              </w:rPr>
+              <w:t>findings[].hosts[].ip</w:t>
+            </w:r>
+            <w:r>
+              <w:t>}}</w:t>
+            </w:r>
+          </w:p>
+        </w:tc>
+      </w:tr>
+    </w:tbl>
+    <w:p>
+      <w:pPr>
         <w:pStyle w:val="Heading1"/>
       </w:pPr>
       <w:r>

</xml_diff>

<commit_message>
Add if/else, switch, and AND/OR examples to the sample Word template.
Co-authored-by: Cursor <cursoragent@cursor.com>
</commit_message>
<xml_diff>
--- a/submissions/word-document-generator-from-template/assets/sample-template.docx
+++ b/submissions/word-document-generator-from-template/assets/sample-template.docx
@@ -567,6 +567,152 @@
     </w:p>
     <w:p>
       <w:pPr>
+        <w:pStyle w:val="Heading1"/>
+      </w:pPr>
+      <w:r>
+        <w:t>Distribution status</w:t>
+      </w:r>
+    </w:p>
+    <w:p>
+      <w:r>
+        <w:t>{{#if document.status == "Final"}}</w:t>
+      </w:r>
+    </w:p>
+    <w:p>
+      <w:r>
+        <w:t xml:space="preserve">Approved for distribution. Document owner: </w:t>
+      </w:r>
+      <w:r>
+        <w:t>{{</w:t>
+      </w:r>
+      <w:r>
+        <w:rPr>
+          <w:b/>
+        </w:rPr>
+        <w:t>document.owner</w:t>
+      </w:r>
+      <w:r>
+        <w:t>}}</w:t>
+      </w:r>
+    </w:p>
+    <w:p>
+      <w:r>
+        <w:t>{{#else}}</w:t>
+      </w:r>
+    </w:p>
+    <w:p>
+      <w:r>
+        <w:t xml:space="preserve">This report is currently in </w:t>
+      </w:r>
+      <w:r>
+        <w:t>{{</w:t>
+      </w:r>
+      <w:r>
+        <w:rPr>
+          <w:b/>
+        </w:rPr>
+        <w:t>document.status</w:t>
+      </w:r>
+      <w:r>
+        <w:t>}}</w:t>
+      </w:r>
+      <w:r>
+        <w:t xml:space="preserve"> status and has not yet been approved for distribution.</w:t>
+      </w:r>
+    </w:p>
+    <w:p>
+      <w:r>
+        <w:t>{{/if}}</w:t>
+      </w:r>
+    </w:p>
+    <w:p>
+      <w:pPr>
+        <w:pStyle w:val="Heading1"/>
+      </w:pPr>
+      <w:r>
+        <w:t>Document routing</w:t>
+      </w:r>
+    </w:p>
+    <w:p>
+      <w:r>
+        <w:t>{{#switch document.type}}</w:t>
+      </w:r>
+    </w:p>
+    <w:p>
+      <w:r>
+        <w:t>{{#case "Report"}}</w:t>
+      </w:r>
+    </w:p>
+    <w:p>
+      <w:r>
+        <w:t>Route through the document management system for version control and sign-off.</w:t>
+      </w:r>
+    </w:p>
+    <w:p>
+      <w:r>
+        <w:t>{{#case "Briefing"}}</w:t>
+      </w:r>
+    </w:p>
+    <w:p>
+      <w:r>
+        <w:t>Forward directly to the named recipients listed in the distribution section.</w:t>
+      </w:r>
+    </w:p>
+    <w:p>
+      <w:r>
+        <w:t>{{#case "Summary"}}</w:t>
+      </w:r>
+    </w:p>
+    <w:p>
+      <w:r>
+        <w:t>Retain with the quarterly records pack for audit and governance review.</w:t>
+      </w:r>
+    </w:p>
+    <w:p>
+      <w:r>
+        <w:t>{{/switch}}</w:t>
+      </w:r>
+    </w:p>
+    <w:p>
+      <w:pPr>
+        <w:pStyle w:val="Heading1"/>
+      </w:pPr>
+      <w:r>
+        <w:t>Access controls</w:t>
+      </w:r>
+    </w:p>
+    <w:p>
+      <w:r>
+        <w:t>{{#if document.status == "Final" &amp;&amp; document.audience == "Leadership team"}}</w:t>
+      </w:r>
+    </w:p>
+    <w:p>
+      <w:r>
+        <w:t>Cleared for direct distribution to the leadership team.</w:t>
+      </w:r>
+    </w:p>
+    <w:p>
+      <w:r>
+        <w:t>{{/if}}</w:t>
+      </w:r>
+    </w:p>
+    <w:p>
+      <w:r>
+        <w:t>{{#if document.status == "Draft" || document.status == "Review"}}</w:t>
+      </w:r>
+    </w:p>
+    <w:p>
+      <w:r>
+        <w:t>This document is under active revision. Obtain written approval before distributing externally.</w:t>
+      </w:r>
+    </w:p>
+    <w:p>
+      <w:r>
+        <w:t>{{/if}}</w:t>
+      </w:r>
+    </w:p>
+    <w:p>
+      <w:pPr>
         <w:sectPr>
           <w:headerReference w:type="default" r:id="rId9"/>
           <w:footerReference w:type="default" r:id="rId10"/>

</xml_diff>